<commit_message>
Keep the submission email out of the public artefacts
The listing requires an email in its submission form, but its stated submission
requirement is only the public Google Doc, the public repository, screenshots and
bugs faced. Printing the address in a Doc that is shared publicly would expose it
for no judging benefit, so Section 8 records that the answer is entered directly
in the form and says why, which also stops the section reading as unfinished.

🤖 Generated with Codebuff
Co-Authored-By: Codebuff <noreply@codebuff.com>
</commit_message>
<xml_diff>
--- a/docs/T3N-Employee-Onboarding-Submission.docx
+++ b/docs/T3N-Employee-Onboarding-Submission.docx
@@ -4801,6 +4801,20 @@
     </w:p>
     <w:p>
       <w:pPr>
+        <w:pStyle w:val="FirstParagraph"/>
+      </w:pPr>
+      <w:r>
+        <w:t xml:space="preserve">The submission form asks three required questions. Two answers are recorded here; the</w:t>
+      </w:r>
+      <w:r>
+        <w:t xml:space="preserve"> </w:t>
+      </w:r>
+      <w:r>
+        <w:t xml:space="preserve">third is entered directly in the form.</w:t>
+      </w:r>
+    </w:p>
+    <w:p>
+      <w:pPr>
         <w:pStyle w:val="Compact"/>
         <w:numPr>
           <w:ilvl w:val="0"/>
@@ -4818,10 +4832,13 @@
         <w:t xml:space="preserve"> </w:t>
       </w:r>
       <w:r>
-        <w:rPr>
-          <w:rStyle w:val="VerbatimChar"/>
-        </w:rPr>
-        <w:t xml:space="preserve">TODO</w:t>
+        <w:t xml:space="preserve">entered directly in the submission form rather than printed in</w:t>
+      </w:r>
+      <w:r>
+        <w:t xml:space="preserve"> </w:t>
+      </w:r>
+      <w:r>
+        <w:t xml:space="preserve">this public Doc. It is used only for contact and the prize payout.</w:t>
       </w:r>
     </w:p>
     <w:p>

</xml_diff>